<commit_message>
Incorpora à NT a NT 1193/2021/COREP e o comprovante de depósito da multa
A COREP (§§ 60-63) afastou expressamente o dano à vista do acórdão do TRF4
e da inexistência de outros danos, concedendo o atenuante de ressarcimento;
depósito judicial de R$ 3.905.734,97 (12/05/2025) registrado como garantia
da multa, sem relação com o art. 2º, II.

Co-Authored-By: Claude Opus 5.5 <noreply@anthropic.com>
Claude-Session: https://claude.ai/code/session_01FeoqTFRB1bKJcz5LGDxsk2
</commit_message>
<xml_diff>
--- a/DECAL/Nota_tecnica/NT_DECAL_art2_II_ressarcimento.docx
+++ b/DECAL/Nota_tecnica/NT_DECAL_art2_II_ressarcimento.docx
@@ -251,7 +251,7 @@
           <w:b w:val="0"/>
           <w:i w:val="0"/>
         </w:rPr>
-        <w:t>Pedido de reabilitação (SEI 4250406) e petição de 14/10/2026, com sentença, parecer do MPF e acórdão do TRF da 4ª Região na Ação Penal nº 5000553-66.2017.4.04.7000;</w:t>
+        <w:t>Nota Técnica nº 1193/2021/COREP/CRG (SEI 1944272);</w:t>
       </w:r>
     </w:p>
     <w:p>
@@ -264,6 +264,26 @@
       </w:pPr>
       <w:r>
         <w:t>2.8.</w:t>
+        <w:tab/>
+      </w:r>
+      <w:r>
+        <w:rPr>
+          <w:b w:val="0"/>
+          <w:i w:val="0"/>
+        </w:rPr>
+        <w:t>Pedido de reabilitação (SEI 4250406) e petição de 14/10/2026, com sentença, parecer do MPF e acórdão do TRF da 4ª Região na Ação Penal nº 5000553-66.2017.4.04.7000; comprovante de depósito judicial da multa (Doc. 4);</w:t>
+      </w:r>
+    </w:p>
+    <w:p>
+      <w:pPr>
+        <w:tabs>
+          <w:tab w:pos="709" w:val="left"/>
+        </w:tabs>
+        <w:ind w:firstLine="0"/>
+        <w:jc w:val="left"/>
+      </w:pPr>
+      <w:r>
+        <w:t>2.9.</w:t>
         <w:tab/>
       </w:r>
       <w:r>
@@ -436,7 +456,7 @@
           <w:b w:val="0"/>
           <w:i w:val="0"/>
         </w:rPr>
-        <w:t>c) a decisão sancionadora, ao adotar o cálculo de multa proposto pela COREP e pela CONJUR, aplicou o atenuante de ressarcimento dos danos (art. 18, II, do Decreto nº 8.420/2015). Com isso, a Administração não manteve prejuízo pendente contra a empresa.</w:t>
+        <w:t>c) na fase de julgamento, a própria CGU afastou o dano. A Nota Técnica nº 1193/2021/COREP considerou a decisão do TRF4 e a inexistência de outros danos e concedeu o atenuante de ressarcimento dos danos (art. 18, II, do Decreto nº 8.420/2015). Esse entendimento foi acolhido pela CONJUR e pela Decisão nº 9, que aplicou a multa assim reduzida.</w:t>
       </w:r>
     </w:p>
     <w:p>
@@ -833,7 +853,7 @@
           <w:b w:val="0"/>
           <w:i w:val="0"/>
         </w:rPr>
-        <w:t>Na fase de julgamento, esse entendimento não foi mantido. A Nota Técnica nº 1193/2021/COREP (SEI 1944272) fez ressalva expressa ao tema, como registra o Parecer nº 00199/2021/CONJUR:</w:t>
+        <w:t>Na fase de julgamento, esse entendimento foi revisto. A Nota Técnica nº 1193/2021/COREP (SEI 1944272), de 26/05/2021, examinou a alegação de inexistência de dano. Transcreveu o voto do TRF4 e concluiu:</w:t>
       </w:r>
     </w:p>
     <w:p>
@@ -848,7 +868,7 @@
           <w:i w:val="0"/>
           <w:sz w:val="20"/>
         </w:rPr>
-        <w:t xml:space="preserve">8. (...) sugerindo, por fim, o acatamento das recomendações feitas pela Comissão no Relatório Final, </w:t>
+        <w:t xml:space="preserve">60. </w:t>
       </w:r>
       <w:r>
         <w:rPr>
@@ -856,7 +876,7 @@
           <w:i w:val="0"/>
           <w:sz w:val="20"/>
         </w:rPr>
-        <w:t>com a ressalva feita no tocante ao dano (parágrafos 57 a 63), que repercutiu no valor da multa</w:t>
+        <w:t>Em que pese o entendimento firmado por este órgão, de que o dano engloba o valor referente ao pagamento de propina, há de se levar em conta, no caso concreto, a referida decisão proferida pelo Poder Judiciário.</w:t>
       </w:r>
       <w:r>
         <w:rPr>
@@ -864,7 +884,23 @@
           <w:i w:val="0"/>
           <w:sz w:val="20"/>
         </w:rPr>
-        <w:t>, e na duração da pena de publicação extraordinária (...). (grifei)</w:t>
+        <w:t xml:space="preserve"> 61. No momento da avaliação das atenuantes, a Comissão atribuiu 0% no caso de ressarcimento dos danos, levando em conta a fixação de dano mínimo pelo juízo criminal de primeira instância. Contudo, houve o afastamento dessa fixação, mantendo-se apenas o confisco sobre o montante da vantagem indevida paga ao agente público. 62. Tal fato, portanto, deve ser levado em consideração no cálculo da multa, bem como </w:t>
+      </w:r>
+      <w:r>
+        <w:rPr>
+          <w:b/>
+          <w:i w:val="0"/>
+          <w:sz w:val="20"/>
+        </w:rPr>
+        <w:t>por não haver outros danos verificados até o momento</w:t>
+      </w:r>
+      <w:r>
+        <w:rPr>
+          <w:b w:val="0"/>
+          <w:i w:val="0"/>
+          <w:sz w:val="20"/>
+        </w:rPr>
+        <w:t>. 63. Dessa forma, sugere-se a concessão da atenuante, elevando-se o seu percentual a 1,5%. (grifei)</w:t>
       </w:r>
     </w:p>
     <w:p>
@@ -884,7 +920,7 @@
           <w:b w:val="0"/>
           <w:i w:val="0"/>
         </w:rPr>
-        <w:t>A repercussão aparece no quadro de dosimetria adotado pela CONJUR (Parecer, § 72). O quadro aplica o atenuante do art. 18, II, do Decreto nº 8.420/2015, "um e meio por cento no caso de comprovação de ressarcimento pela pessoa jurídica dos danos a que tenha dado causa", com o seguinte efeito:</w:t>
+        <w:t>A COREP recomendou acolher o Relatório Final "com a ressalva feita no tocante ao dano (parágrafos 57 a 63), que repercutiu no valor da multa" (§ 124). O Parecer nº 00199/2021/CONJUR adotou essa ressalva (§§ 8 e 72), e os Despachos nº 00651/2022 e nº 00890/2022 o aprovaram "com as adequações da Nota Técnica nº 1193/2021/COREP". O efeito é verificável na própria multa aplicada:</w:t>
       </w:r>
     </w:p>
     <w:p>
@@ -903,7 +939,7 @@
           <w:b w:val="0"/>
           <w:i w:val="0"/>
         </w:rPr>
-        <w:t>a) a alíquota caiu de 7,5% para 6%;</w:t>
+        <w:t>a) o atenuante do art. 18, II, do Decreto nº 8.420/2015 ("comprovação de ressarcimento [...] dos danos") passou de 0% para 1,5%, e a alíquota caiu de 7,5% para 6%;</w:t>
       </w:r>
     </w:p>
     <w:p>
@@ -922,26 +958,7 @@
           <w:b w:val="0"/>
           <w:i w:val="0"/>
         </w:rPr>
-        <w:t>b) a multa caiu de R$ 4.882.168,71 para R$ 3.905.734,97, exatamente 6% da base de cálculo de R$ 65.095.582,89.</w:t>
-      </w:r>
-    </w:p>
-    <w:p>
-      <w:pPr>
-        <w:tabs>
-          <w:tab w:pos="709" w:val="left"/>
-        </w:tabs>
-        <w:ind w:firstLine="0"/>
-        <w:jc w:val="both"/>
-      </w:pPr>
-      <w:r>
-        <w:tab/>
-      </w:r>
-      <w:r>
-        <w:rPr>
-          <w:b w:val="0"/>
-          <w:i w:val="0"/>
-        </w:rPr>
-        <w:t>Os Despachos nº 00651/2022 e nº 00890/2022 aprovaram o Parecer "com as adequações da Nota Técnica nº 1193/2021/COREP". A Decisão nº 9 aplicou a multa de R$ 3.905.734,97. Foi essa, portanto, a parte do Relatório Final que a decisão deixou de adotar.</w:t>
+        <w:t>b) a multa caiu de R$ 4.882.168,71 para R$ 3.905.734,97, exatamente 6% da base de cálculo de R$ 65.095.582,89. Esse é o valor aplicado pela Decisão nº 9.</w:t>
       </w:r>
     </w:p>
     <w:p>
@@ -961,84 +978,7 @@
           <w:b w:val="0"/>
           <w:i w:val="0"/>
         </w:rPr>
-        <w:t>A NT nº 1193/2021/COREP não consta da documentação examinada. Os fundamentos da ressalva (§§ 57 a 63) não puderam ser lidos, mas o seu efeito está documentado na decisão. Há duas leituras possíveis da ressalva, e ambas levam ao mesmo resultado para este requisito:</w:t>
-      </w:r>
-    </w:p>
-    <w:p>
-      <w:pPr>
-        <w:tabs>
-          <w:tab w:pos="709" w:val="left"/>
-        </w:tabs>
-        <w:ind w:firstLine="0"/>
-        <w:jc w:val="both"/>
-      </w:pPr>
-      <w:r>
-        <w:tab/>
-      </w:r>
-      <w:r>
-        <w:rPr>
-          <w:b w:val="0"/>
-          <w:i w:val="0"/>
-        </w:rPr>
-        <w:t>a) a COREP entendeu que não havia dano a considerar;</w:t>
-      </w:r>
-    </w:p>
-    <w:p>
-      <w:pPr>
-        <w:tabs>
-          <w:tab w:pos="709" w:val="left"/>
-        </w:tabs>
-        <w:ind w:firstLine="0"/>
-        <w:jc w:val="both"/>
-      </w:pPr>
-      <w:r>
-        <w:tab/>
-      </w:r>
-      <w:r>
-        <w:rPr>
-          <w:b w:val="0"/>
-          <w:i w:val="0"/>
-        </w:rPr>
-        <w:t>b) a COREP entendeu que o dano estava recomposto.</w:t>
-      </w:r>
-    </w:p>
-    <w:p>
-      <w:pPr>
-        <w:tabs>
-          <w:tab w:pos="709" w:val="left"/>
-        </w:tabs>
-        <w:ind w:firstLine="0"/>
-        <w:jc w:val="both"/>
-      </w:pPr>
-      <w:r>
-        <w:tab/>
-      </w:r>
-      <w:r>
-        <w:rPr>
-          <w:b w:val="0"/>
-          <w:i w:val="0"/>
-        </w:rPr>
-        <w:t>Em qualquer delas, a autoridade julgadora não manteve, contra a DECAL, prejuízo pendente de ressarcimento. O Parecer transcreve, no § 66, a frase da Comissão sobre o dano. A transcrição está no rol de fatores do art. 7º da Lei nº 12.846/2013 e é superada pelo cálculo efetivamente adotado nos §§ 72 e 73. Prevalece a parte dispositiva acolhida pela decisão.</w:t>
-      </w:r>
-    </w:p>
-    <w:p>
-      <w:pPr>
-        <w:tabs>
-          <w:tab w:pos="709" w:val="left"/>
-        </w:tabs>
-        <w:ind w:firstLine="0"/>
-        <w:jc w:val="both"/>
-      </w:pPr>
-      <w:r>
-        <w:t>4.2.6.</w:t>
-        <w:tab/>
-      </w:r>
-      <w:r>
-        <w:rPr>
-          <w:b w:val="0"/>
-          <w:i w:val="0"/>
-        </w:rPr>
-        <w:t>Coerentemente, a Decisão nº 9 não quantifica dano nem condiciona a reabilitação a qualquer pagamento. Nisso difere da decisão examinada na NT nº 676/2026, que fixava expressamente tais condições.</w:t>
+        <w:t>Em síntese, a autoridade julgadora não manteve dano pendente contra a DECAL. Fez isso com fundamento expresso: o afastamento judicial da indenização e a inexistência de outros danos verificados. O Parecer da CONJUR ainda transcreve, no § 66, a frase da Comissão sobre o dano mínimo. A transcrição está no rol de fatores do art. 7º da Lei nº 12.846/2013 e é superada pelo cálculo efetivamente adotado nos §§ 72 e 73. Coerentemente, a Decisão nº 9 não quantifica dano nem condiciona a reabilitação a qualquer pagamento. Nisso difere da decisão examinada na NT nº 676/2026, que fixava expressamente tais condições.</w:t>
       </w:r>
     </w:p>
     <w:p>
@@ -1139,7 +1079,7 @@
           <w:b w:val="0"/>
           <w:i w:val="0"/>
         </w:rPr>
-        <w:t>O acórdão é anterior ao Relatório Final (24/02/2021), que não o menciona. A CGU tinha conhecimento do andamento da ação penal no TRF4 (Parecer, § 31). Quando a Comissão citou a sentença como base do dano mínimo, esse ponto da sentença já havia sido retirado pelo tribunal.</w:t>
+        <w:t>O acórdão é anterior ao Relatório Final (24/02/2021), que não o menciona. Quando a Comissão citou a sentença como base do dano mínimo, esse ponto já havia sido retirado pelo tribunal. A falha foi corrigida pela COREP (item 4.2.3).</w:t>
       </w:r>
     </w:p>
     <w:p>
@@ -1220,7 +1160,7 @@
           <w:b w:val="0"/>
           <w:i w:val="0"/>
         </w:rPr>
-        <w:t xml:space="preserve"> Procede, com fundamento mais amplo que o apresentado. Além da reforma da sentença, pesa o fato de que a própria decisão sancionadora, ao adotar a ressalva da COREP, não manteve dano pendente contra a empresa (itens 4.2.3 a 4.2.6). A empresa não alegou esse ponto.</w:t>
+        <w:t xml:space="preserve"> Procede, com fundamento mais amplo que o apresentado. Além da reforma da sentença, pesa o fato de que a própria decisão sancionadora, ao adotar a ressalva da COREP, não manteve dano pendente contra a empresa (itens 4.2.3 a 4.2.5). A empresa não alegou esse ponto.</w:t>
       </w:r>
     </w:p>
     <w:p>
@@ -1274,7 +1214,7 @@
           <w:b w:val="0"/>
           <w:i w:val="0"/>
         </w:rPr>
-        <w:t xml:space="preserve"> É irrelevante para o inciso II. A multa é sanção e não se confunde com reparação do dano (art. 6º, § 3º, da Lei nº 12.846/2013). O depósito judicial apenas suspende a exigibilidade da multa por decisão precária do TRF5, e as próprias demonstrações financeiras da empresa registram que ele não liquida o passivo (DFs 2025, nota 2.6). A quitação da multa é requisito de reabilitação apenas no regime da Lei nº 14.133/2021 (art. 163, II), e não no art. 87, IV, da Lei nº 8.666/1993.</w:t>
+        <w:t xml:space="preserve"> É irrelevante para o inciso II. O Doc. 4 comprova o depósito judicial de R$ 3.905.734,97, valor nominal da multa, em 12/05/2025, por guia DJE da Caixa, nos autos da ação anulatória nº 0823992-04.2023.4.05.8300 (2ª Vara Federal/PE). A multa, porém, é sanção e não se confunde com reparação do dano (art. 6º, § 3º, da Lei nº 12.846/2013). Além disso, o depósito não é pagamento: apenas suspende a exigibilidade da multa, por decisão precária do TRF5, e as próprias demonstrações financeiras da empresa registram que ele não liquida o passivo (DFs 2025, nota 2.6). A quitação da multa é requisito de reabilitação apenas no regime da Lei nº 14.133/2021 (art. 163, II), e não no art. 87, IV, da Lei nº 8.666/1993.</w:t>
       </w:r>
     </w:p>
     <w:p>
@@ -1342,7 +1282,7 @@
           <w:b w:val="0"/>
           <w:i w:val="0"/>
         </w:rPr>
-        <w:t xml:space="preserve"> A presunção de que a propina foi embutida no preço cede diante de prova específica em contrário: a conclusão do TRF4, os depoimentos sobre a formação do preço e a informação da Petrobras (item 4.3.3). Foi a própria Administração que, na dosimetria, deixou de manter o dano.</w:t>
+        <w:t xml:space="preserve"> A presunção de que a propina foi embutida no preço cede diante de prova específica em contrário: a conclusão do TRF4, os depoimentos sobre a formação do preço e a informação da Petrobras (item 4.3.3). A COREP registrou expressamente que, apesar do entendimento geral da CGU, a decisão judicial devia prevalecer no caso concreto (item 4.2.3).</w:t>
       </w:r>
     </w:p>
     <w:p>
@@ -1430,7 +1370,7 @@
           <w:b w:val="0"/>
           <w:i w:val="0"/>
         </w:rPr>
-        <w:t xml:space="preserve">Os documentos e argumentos apresentados pela DECAL BRASIL LTDA., examinados em conjunto com o Relatório Final, o Parecer nº 00199/2021/CONJUR-CGU/CGU/AGU e a Decisão nº 9/2023, são suficientes para considerar </w:t>
+        <w:t xml:space="preserve">Os documentos e argumentos apresentados pela DECAL BRASIL LTDA., examinados em conjunto com o Relatório Final, a Nota Técnica nº 1193/2021/COREP, o Parecer nº 00199/2021/CONJUR-CGU/CGU/AGU e a Decisão nº 9/2023, são suficientes para considerar </w:t>
       </w:r>
       <w:r>
         <w:rPr>

</xml_diff>

<commit_message>
Revisão independente da NT do art. 2º, II (DECAL) e versão corrigida
Qualifica a conclusão ao período documentado e inclui o MPF como destinatário
da consulta; trata o contraponto da IN 2/2018; reconhece o apontamento da
CPAR (art. 6º, §3º) e por que não subsistiu; enfrenta o RMS 33.526; corrige
referência ao TRF5 e afirmação sobre quitação da multa. Conclusão mantida.

Co-Authored-By: Claude Opus 5.5 <noreply@anthropic.com>
Claude-Session: https://claude.ai/code/session_01FeoqTFRB1bKJcz5LGDxsk2
</commit_message>
<xml_diff>
--- a/DECAL/Nota_tecnica/NT_DECAL_art2_II_ressarcimento.docx
+++ b/DECAL/Nota_tecnica/NT_DECAL_art2_II_ressarcimento.docx
@@ -271,7 +271,7 @@
           <w:b w:val="0"/>
           <w:i w:val="0"/>
         </w:rPr>
-        <w:t>Pedido de reabilitação (SEI 4250406) e petição de 14/10/2026, com sentença, parecer do MPF e acórdão do TRF da 4ª Região na Ação Penal nº 5000553-66.2017.4.04.7000; comprovante de depósito judicial da multa (Doc. 4);</w:t>
+        <w:t>Pedido de reabilitação (SEI 4250406) e petição de 14/10/2026, com sentença, parecer do MPF e acórdão do TRF da 4ª Região na Ação Penal nº 5000553-66.2017.4.04.7000; comprovante de depósito judicial da multa (Doc. 4) e demonstrações financeiras de 2025 (Doc. 8);</w:t>
       </w:r>
     </w:p>
     <w:p>
@@ -284,6 +284,26 @@
       </w:pPr>
       <w:r>
         <w:t>2.9.</w:t>
+        <w:tab/>
+      </w:r>
+      <w:r>
+        <w:rPr>
+          <w:b w:val="0"/>
+          <w:i w:val="0"/>
+        </w:rPr>
+        <w:t>Acórdão do TRF da 5ª Região no Agravo de Instrumento nº 0809667-58.2024.4.05.0000 (05/02/2025);</w:t>
+      </w:r>
+    </w:p>
+    <w:p>
+      <w:pPr>
+        <w:tabs>
+          <w:tab w:pos="709" w:val="left"/>
+        </w:tabs>
+        <w:ind w:firstLine="0"/>
+        <w:jc w:val="left"/>
+      </w:pPr>
+      <w:r>
+        <w:t>2.10.</w:t>
         <w:tab/>
       </w:r>
       <w:r>
@@ -345,7 +365,7 @@
           <w:b w:val="0"/>
           <w:i w:val="0"/>
         </w:rPr>
-        <w:t>Pela Decisão nº 9, publicada em 10/02/2023, o Ministro de Estado da CGU aplicou à empresa declaração de inidoneidade (art. 87, IV, da Lei nº 8.666/1993), multa de R$ 3.905.734,97 e publicação extraordinária da decisão. A decisão adotou, em parte, o Relatório Final e o Parecer nº 00199/2021/CONJUR-CGU/CGU/AGU. As sanções foram mantidas pela Decisão nº 347, publicada no DOU de 27/10/2023.</w:t>
+        <w:t>Pela Decisão nº 9, assinada em 09/02/2023 e publicada em 10/02/2023, o Ministro de Estado da CGU aplicou à empresa declaração de inidoneidade (art. 87, IV, da Lei nº 8.666/1993), multa de R$ 3.905.734,97 e publicação extraordinária da decisão. A decisão adotou como fundamento, em parte, o Relatório Final e, ainda, o Parecer nº 00199/2021/CONJUR-CGU/CGU/AGU. As sanções foram mantidas pela Decisão nº 347, publicada no DOU de 27/10/2023.</w:t>
       </w:r>
     </w:p>
     <w:p>
@@ -456,7 +476,7 @@
           <w:b w:val="0"/>
           <w:i w:val="0"/>
         </w:rPr>
-        <w:t>c) na fase de julgamento, a própria CGU afastou o dano. A Nota Técnica nº 1193/2021/COREP considerou a decisão do TRF4 e a inexistência de outros danos e concedeu o atenuante de ressarcimento dos danos (art. 18, II, do Decreto nº 8.420/2015). Esse entendimento foi acolhido pela CONJUR e pela Decisão nº 9, que aplicou a multa assim reduzida.</w:t>
+        <w:t>c) na fase de julgamento, a própria CGU afastou o dano. A Nota Técnica nº 1193/2021/COREP considerou a decisão do TRF4 e a inexistência de outros danos e propôs o atenuante de ressarcimento dos danos (art. 18, II, do Decreto nº 8.420/2015). Esse entendimento foi acolhido pela CONJUR e pela Decisão nº 9, que aplicou a multa assim reduzida.</w:t>
       </w:r>
     </w:p>
     <w:p>
@@ -475,7 +495,7 @@
           <w:b w:val="0"/>
           <w:i w:val="0"/>
         </w:rPr>
-        <w:t>Dois argumentos da empresa não procedem: a força vinculante da decisão criminal (art. 935 do Código Civil) e o depósito judicial da multa. Nenhum deles, porém, é necessário à conclusão. Recomenda-se apenas confirmar, junto à Petrobras e à AGU, que não sobreveio decisão definitiva fixando dano.</w:t>
+        <w:t>Dois argumentos da empresa não procedem: a força vinculante da decisão criminal (art. 935 do Código Civil) e o depósito judicial da multa. Nenhum deles, porém, é necessário à conclusão. Antes da decisão, recomenda-se confirmar, junto à Petrobras, à AGU e ao MPF, que não sobreveio, desde o PAR, decisão definitiva fixando dano pelos mesmos fatos.</w:t>
       </w:r>
     </w:p>
     <w:p>
@@ -659,7 +679,7 @@
           <w:b w:val="0"/>
           <w:i w:val="0"/>
         </w:rPr>
-        <w:t>: o dano admitido pela pessoa jurídica ou o decorrente de decisão definitiva em processo administrativo ou judicial (art. 37, § 2º, do Decreto nº 11.129/2022; art. 33 da PNI nº 1/2025). A Nota Técnica nº 676/2026/SIPRI aplicou esse critério a caso idêntico de sanção da Lei nº 8.666/1993:</w:t>
+        <w:t>: o dano admitido pela pessoa jurídica ou o decorrente de decisão definitiva em processo administrativo ou judicial (art. 37, § 2º, do Decreto nº 11.129/2022; art. 33 da PNI nº 1/2025). A Nota Técnica nº 676/2026/SIPRI aplicou esse critério a outro caso de inidoneidade aplicada com base na Lei nº 8.666/1993:</w:t>
       </w:r>
     </w:p>
     <w:p>
@@ -753,6 +773,26 @@
     </w:p>
     <w:p>
       <w:pPr>
+        <w:tabs>
+          <w:tab w:pos="709" w:val="left"/>
+        </w:tabs>
+        <w:ind w:firstLine="0"/>
+        <w:jc w:val="both"/>
+      </w:pPr>
+      <w:r>
+        <w:t>4.1.6.</w:t>
+        <w:tab/>
+      </w:r>
+      <w:r>
+        <w:rPr>
+          <w:b w:val="0"/>
+          <w:i w:val="0"/>
+        </w:rPr>
+        <w:t>O resultado não depende de qual norma se aplica ao § 1º. Pela IN nº 2/2018, vigente no PAR, a propina integrava a rubrica de ressarcimento. Mesmo sob essa norma, a CGU deixou de considerá-la dano neste caso concreto, em 2021, à vista da decisão judicial (item 4.2.3).</w:t>
+      </w:r>
+    </w:p>
+    <w:p>
+      <w:pPr>
         <w:keepNext/>
         <w:spacing w:before="120" w:after="80"/>
         <w:ind w:left="567"/>
@@ -833,7 +873,7 @@
           <w:b w:val="0"/>
           <w:i w:val="0"/>
         </w:rPr>
-        <w:t>A referência ao dano tem, portanto, um único fundamento: a sentença criminal. Ela se repete no § 73 e no cálculo da multa. Ao negar o atenuante de ressarcimento, a Comissão afirmou que "evidenciou-se a ocorrência de dano de, no mínimo, o montante pago a título de vantagem indevida (...). Nesse sentido se manifestou o juízo criminal ao prolatar a sentença" (§ 95). Na conclusão, a Comissão registrou como "valor do dano à Administração" US$ 868.450,00 (R$ 4.704.914,72 em 24/02/2021). O registro foi feito para os encaminhamentos do Capítulo VI da Lei nº 12.846/2013, ou seja, para que o Ministério Público e a AGU avaliassem eventual responsabilização judicial. Não constituiu crédito de ressarcimento. Não houve o processo específico de reparação previsto no art. 13 daquela lei.</w:t>
+        <w:t>A referência ao dano tem, portanto, um único fundamento: a sentença criminal. Ela se repete no § 73 e no cálculo da multa. Ao negar o atenuante de ressarcimento, a Comissão afirmou que "evidenciou-se a ocorrência de dano de, no mínimo, o montante pago a título de vantagem indevida (...). Nesse sentido se manifestou o juízo criminal ao prolatar a sentença" (§ 95). Na conclusão, a Comissão registrou como "valor do dano à Administração" US$ 868.450,00 (R$ 4.704.914,72 em 24/02/2021). O registro foi feito "para os fins dos encaminhamentos previstos no Cap. VI da Lei nº 12.846/2013 e também considerando a previsão constante em seu §3º, do artigo 6º", que trata da obrigação de reparar o dano. A Comissão também propôs comunicar os fatos ao Ministério Público e à AGU para eventual responsabilização judicial. Trata-se, portanto, de verdadeiro apontamento de dano pela Comissão, mas apoiado unicamente na sentença e sujeito ao julgamento. Ele não constituiu crédito de ressarcimento. Nos documentos examinados não há notícia de processo específico de reparação (art. 13 daquela lei).</w:t>
       </w:r>
     </w:p>
     <w:p>
@@ -970,6 +1010,25 @@
         <w:jc w:val="both"/>
       </w:pPr>
       <w:r>
+        <w:tab/>
+      </w:r>
+      <w:r>
+        <w:rPr>
+          <w:b w:val="0"/>
+          <w:i w:val="0"/>
+        </w:rPr>
+        <w:t>A Decisão nº 9 também fixou o edital em 60 dias, e não nos 45 propostos pela Comissão, conforme o outro ajuste da COREP (§ 110). O "em parte" da adoção do Relatório Final corresponde, portanto, às duas ressalvas da COREP: a do dano e a do edital.</w:t>
+      </w:r>
+    </w:p>
+    <w:p>
+      <w:pPr>
+        <w:tabs>
+          <w:tab w:pos="709" w:val="left"/>
+        </w:tabs>
+        <w:ind w:firstLine="0"/>
+        <w:jc w:val="both"/>
+      </w:pPr>
+      <w:r>
         <w:t>4.2.5.</w:t>
         <w:tab/>
       </w:r>
@@ -978,7 +1037,7 @@
           <w:b w:val="0"/>
           <w:i w:val="0"/>
         </w:rPr>
-        <w:t>Em síntese, a autoridade julgadora não manteve dano pendente contra a DECAL. Fez isso com fundamento expresso: o afastamento judicial da indenização e a inexistência de outros danos verificados. O Parecer da CONJUR ainda transcreve, no § 66, a frase da Comissão sobre o dano mínimo. A transcrição está no rol de fatores do art. 7º da Lei nº 12.846/2013 e é superada pelo cálculo efetivamente adotado nos §§ 72 e 73. Coerentemente, a Decisão nº 9 não quantifica dano nem condiciona a reabilitação a qualquer pagamento. Nisso difere da decisão examinada na NT nº 676/2026, que fixava expressamente tais condições.</w:t>
+        <w:t>Em síntese, ao decidir, a autoridade julgadora não manteve o apontamento de dano feito pela Comissão. Adotou fundamento expresso: o afastamento judicial da indenização e a inexistência de outros danos verificados. Isso se deu na dosimetria e não equivale a declaração formal de inexistência de dano (item 4.5.3). Basta, porém, para afastar a existência de prejuízo apontado e pendente. O Parecer da CONJUR ainda transcreve, no § 66, a frase da Comissão sobre o dano mínimo. A transcrição está no rol de fatores do art. 7º da Lei nº 12.846/2013 e é superada pelo cálculo efetivamente adotado nos §§ 72 e 73. Coerentemente, a Decisão nº 9 não quantifica dano nem condiciona a reabilitação a qualquer pagamento. Nisso difere da decisão examinada na NT nº 676/2026, que fixava expressamente tais condições.</w:t>
       </w:r>
     </w:p>
     <w:p>
@@ -1079,7 +1138,7 @@
           <w:b w:val="0"/>
           <w:i w:val="0"/>
         </w:rPr>
-        <w:t>O acórdão é anterior ao Relatório Final (24/02/2021), que não o menciona. Quando a Comissão citou a sentença como base do dano mínimo, esse ponto já havia sido retirado pelo tribunal. A falha foi corrigida pela COREP (item 4.2.3).</w:t>
+        <w:t>O acórdão é anterior ao Relatório Final (24/02/2021), que não o menciona. Quando a Comissão citou a sentença como base do dano mínimo, esse ponto já havia sido retirado pelo tribunal. A omissão foi suprida pela COREP (item 4.2.3).</w:t>
       </w:r>
     </w:p>
     <w:p>
@@ -1099,7 +1158,7 @@
           <w:b w:val="0"/>
           <w:i w:val="0"/>
         </w:rPr>
-        <w:t>Outros elementos convergem: Paulo Roberto Costa declarou que o preço foi fixado pela área técnica, sem sua interferência, e o representante da Petrobras na contratação negou ingerência indevida (Parecer, §§ 46 e 47; sentença, §§ 184 a 186). A Petrobras informou que, nesse tipo de contratação, os preços são fixados por comparação com o mercado, sem planilha de formação de custos (Relatório Final, § 97). Não há nos autos indício de sobrepreço que permita supor que a propina foi repassada à estatal.</w:t>
+        <w:t>Outros elementos convergem: Paulo Roberto Costa declarou que o preço foi fixado pela área técnica, sem sua interferência, e o representante da Petrobras na contratação negou ingerência indevida (Parecer, §§ 46 e 47; sentença, §§ 184 a 186). A Petrobras informou que, nesse tipo de contratação, os preços são fixados por comparação com o mercado, sem planilha de formação de custos (Relatório Final, § 97). Não há, nos documentos examinados, indício de sobrepreço que permita supor que a propina foi repassada à estatal.</w:t>
       </w:r>
     </w:p>
     <w:p>
@@ -1119,7 +1178,7 @@
           <w:b w:val="0"/>
           <w:i w:val="0"/>
         </w:rPr>
-        <w:t>Por fim, o acórdão do TRF da 5ª Região que manteve as sanções (AI nº 0809667-58.2024.4.05.0000, 05/02/2025) registrou que a alegada ausência de dano não afasta a responsabilização, "mas tão somente [serve] para impedir a condenação pelo dano". Reconheceu, assim, a pertinência da questão exatamente para o tema aqui examinado.</w:t>
+        <w:t>Por fim, o acórdão do TRF da 5ª Região que negou a suspensão das sanções (AI nº 0809667-58.2024.4.05.0000, 05/02/2025) registrou, de passagem, que a alegada ausência de dano não afasta a responsabilização, "mas tão somente [serve] para impedir a condenação pelo dano". A decisão é provisória e não examinou a reabilitação, mas o registro é coerente com a distinção feita nesta Nota entre sanção e ressarcimento.</w:t>
       </w:r>
     </w:p>
     <w:p>
@@ -1187,7 +1246,7 @@
           <w:b w:val="0"/>
           <w:i w:val="0"/>
         </w:rPr>
-        <w:t xml:space="preserve"> Não procede. A DECAL não foi parte na ação penal, e a CGU já rejeitou essa tese no PAR (Relatório Final, § 44; Parecer, § 50). Além disso, o art. 935 impede rediscutir a existência do fato e a autoria, e não o valor do dano. O TRF4 não declarou que o dano é inexistente; constatou que não estava provado no processo criminal. O acórdão vale aqui como prova relevante, e não como decisão que vincula a Administração. A conclusão desta Nota não depende dessa tese.</w:t>
+        <w:t xml:space="preserve"> Não procede. A DECAL não foi parte na ação penal, e a CGU já rejeitou essa tese no PAR (Relatório Final, §§ 44 e 54; Parecer, § 50). Além disso, o art. 935 impede rediscutir a existência do fato e a autoria, e não o valor do dano. O TRF4 não declarou que o dano é inexistente; constatou que não estava provado no processo criminal. O acórdão vale aqui como prova relevante, e não como decisão que vincula a Administração. A conclusão desta Nota não depende dessa tese.</w:t>
       </w:r>
     </w:p>
     <w:p>
@@ -1214,7 +1273,7 @@
           <w:b w:val="0"/>
           <w:i w:val="0"/>
         </w:rPr>
-        <w:t xml:space="preserve"> É irrelevante para o inciso II. O Doc. 4 comprova o depósito judicial de R$ 3.905.734,97, valor nominal da multa, em 12/05/2025, por guia DJE da Caixa, nos autos da ação anulatória nº 0823992-04.2023.4.05.8300 (2ª Vara Federal/PE). A multa, porém, é sanção e não se confunde com reparação do dano (art. 6º, § 3º, da Lei nº 12.846/2013). Além disso, o depósito não é pagamento: apenas suspende a exigibilidade da multa, por decisão precária do TRF5, e as próprias demonstrações financeiras da empresa registram que ele não liquida o passivo (DFs 2025, nota 2.6). A quitação da multa é requisito de reabilitação apenas no regime da Lei nº 14.133/2021 (art. 163, II), e não no art. 87, IV, da Lei nº 8.666/1993.</w:t>
+        <w:t xml:space="preserve"> É irrelevante para o inciso II. O Doc. 4 comprova o depósito judicial de R$ 3.905.734,97, valor nominal da multa, em 12/05/2025, por guia DJE da Caixa, nos autos da ação anulatória nº 0823992-04.2023.4.05.8300 (2ª Vara Federal/PE). A multa, porém, é sanção e não se confunde com reparação do dano (art. 6º, § 3º, da Lei nº 12.846/2013). Além disso, o depósito não é pagamento: apenas suspende a exigibilidade da multa, por decisão precária do TRF5, e as próprias demonstrações financeiras da empresa registram que ele não liquida o passivo (DFs 2025, nota 2.6). Se a quitação da multa é, ou não, exigível como requisito autônomo, à luz do art. 163, II, da Lei nº 14.133/2021 e da Portaria Normativa SE/CGU nº 226/2025, é questão a examinar à parte. Ela não integra o inciso II do art. 2º da Portaria nº 1.214/2020 nem o art. 87, IV, da Lei nº 8.666/1993.</w:t>
       </w:r>
     </w:p>
     <w:p>
@@ -1227,6 +1286,33 @@
       </w:pPr>
       <w:r>
         <w:t>4.4.4.</w:t>
+        <w:tab/>
+      </w:r>
+      <w:r>
+        <w:rPr>
+          <w:b/>
+          <w:i w:val="0"/>
+        </w:rPr>
+        <w:t>Precedente do STF (RMS nº 33.526/DF).</w:t>
+      </w:r>
+      <w:r>
+        <w:rPr>
+          <w:b w:val="0"/>
+          <w:i w:val="0"/>
+        </w:rPr>
+        <w:t xml:space="preserve"> A empresa invoca decisão do Min. Gilmar Mendes (pedido, §§ 22 e 29), confirmada pela 2ª Turma em agravo regimental (sessão virtual de 22 a 28/09/2017). Segundo o trecho transcrito, não se pode negar a reabilitação com base em dano não apurado nem arbitrado. O precedente vale apenas entre as partes daquele processo, mas é coerente com a conclusão desta Nota. A tese de que a reabilitação seria ato vinculado não precisa ser examinada para o inciso II.</w:t>
+      </w:r>
+    </w:p>
+    <w:p>
+      <w:pPr>
+        <w:tabs>
+          <w:tab w:pos="709" w:val="left"/>
+        </w:tabs>
+        <w:ind w:firstLine="0"/>
+        <w:jc w:val="both"/>
+      </w:pPr>
+      <w:r>
+        <w:t>4.4.5.</w:t>
         <w:tab/>
       </w:r>
       <w:r>
@@ -1309,7 +1395,7 @@
           <w:b w:val="0"/>
           <w:i w:val="0"/>
         </w:rPr>
-        <w:t xml:space="preserve"> O registro destinava-se à comunicação ao Ministério Público e à AGU para eventual ação judicial. Se dessa comunicação, ou de iniciativa da Petrobras, tiver resultado decisão definitiva fixando dano, o quadro muda. Nada nos autos indica isso, mas o art. 4º, § 2º, da Portaria nº 1.214/2020 permite confirmá-lo, como se fez na NT nº 676/2026.</w:t>
+        <w:t xml:space="preserve"> O apontamento da Comissão não subsistiu no julgamento (itens 4.2.3 a 4.2.5). Restam duas hipóteses: a comunicação ao Ministério Público e à AGU, ou iniciativa da Petrobras, pode ter resultado, depois de 2021, em decisão definitiva fixando dano. Se isso ocorreu, o quadro muda. Nada nos documentos examinados o indica, e a CGU não pode atestar a inexistência de crédito de terceiro sem consultá-lo. Daí a diligência do item 5.2, prevista no art. 4º, § 2º, da Portaria nº 1.214/2020 e adotada na NT nº 676/2026.</w:t>
       </w:r>
     </w:p>
     <w:p>
@@ -1384,7 +1470,7 @@
           <w:b w:val="0"/>
           <w:i w:val="0"/>
         </w:rPr>
-        <w:t>. Não há prejuízo identificado e quantificado pela Administração, por decisão definitiva, pendente de ressarcimento em decorrência dos atos que justificaram a declaração de inidoneidade.</w:t>
+        <w:t>. O único prejuízo apontado no PAR não foi mantido pela decisão sancionadora. Nos documentos examinados, não há prejuízo identificado e quantificado por decisão definitiva e pendente de ressarcimento em decorrência dos atos que justificaram a declaração de inidoneidade.</w:t>
       </w:r>
     </w:p>
     <w:p>
@@ -1404,7 +1490,7 @@
           <w:b w:val="0"/>
           <w:i w:val="0"/>
         </w:rPr>
-        <w:t>Recomenda-se, antes da decisão final e com fundamento no art. 4º, § 2º, da Portaria nº 1.214/2020, oficiar à Petrobras e à Advocacia-Geral da União, com cópia ao Ministério Público Federal, a quem o Relatório Final propôs comunicar os fatos. O objetivo é confirmar a inexistência de decisão administrativa ou judicial definitiva, posterior ao PAR, que tenha fixado dano à estatal pelos mesmos fatos. Resposta em sentido contrário imporá o reexame deste requisito.</w:t>
+        <w:t>A conclusão do item 5.1 está documentada até o julgamento do PAR. Para torná-la definitiva, recomenda-se, antes da decisão final e com fundamento no art. 4º, § 2º, da Portaria nº 1.214/2020, oficiar à Petrobras, à Advocacia-Geral da União e ao Ministério Público Federal. Os dois últimos são os órgãos a quem o Relatório Final propôs comunicar os fatos. O objetivo é confirmar a inexistência de decisão administrativa ou judicial definitiva, posterior a 24/02/2021, que tenha fixado dano à Petrobras pelos mesmos fatos. Respostas negativas confirmam a conclusão. Resposta em sentido contrário imporá o reexame deste requisito, com ciência prévia à interessada.</w:t>
       </w:r>
     </w:p>
     <w:p>
@@ -1444,7 +1530,7 @@
           <w:b w:val="0"/>
           <w:i w:val="0"/>
         </w:rPr>
-        <w:t>À consideração superior.</w:t>
+        <w:t>À consideração superior, com posterior encaminhamento à Consultoria Jurídica (art. 6º da Portaria nº 1.214/2020).</w:t>
       </w:r>
     </w:p>
     <w:p>

</xml_diff>

<commit_message>
Auditoria técnico-jurídica (4ª revisão) da NT do art. 2º, II - DECAL
Requisito passa a 'superado' (não 'atendido'); fundamento deslocado do
atenuante do art. 18, II, para o juízo expresso da COREP sobre o dano;
consulta ampliada (TCU, SFC; qualquer data); depoimentos citados com
fidelidade; contraponto da falta de alternativa de tancagem registrado.

Co-Authored-By: Claude Opus 5.5 <noreply@anthropic.com>
Claude-Session: https://claude.ai/code/session_01FeoqTFRB1bKJcz5LGDxsk2
</commit_message>
<xml_diff>
--- a/DECAL/Nota_tecnica/NT_DECAL_art2_II_ressarcimento.docx
+++ b/DECAL/Nota_tecnica/NT_DECAL_art2_II_ressarcimento.docx
@@ -412,14 +412,14 @@
           <w:b/>
           <w:i w:val="0"/>
         </w:rPr>
-        <w:t>atendido</w:t>
+        <w:t>superado</w:t>
       </w:r>
       <w:r>
         <w:rPr>
           <w:b w:val="0"/>
           <w:i w:val="0"/>
         </w:rPr>
-        <w:t>, por três razões:</w:t>
+        <w:t>, por não haver prejuízo apontado pendente de ressarcimento. São três as razões:</w:t>
       </w:r>
     </w:p>
     <w:p>
@@ -495,7 +495,7 @@
           <w:b w:val="0"/>
           <w:i w:val="0"/>
         </w:rPr>
-        <w:t>Dois argumentos da empresa não procedem: a força vinculante da decisão criminal (art. 935 do Código Civil) e o depósito judicial da multa. Nenhum deles, porém, é necessário à conclusão. Antes da decisão, recomenda-se confirmar, junto à Petrobras, à AGU e ao MPF, que não sobreveio, desde o PAR, decisão definitiva fixando dano pelos mesmos fatos.</w:t>
+        <w:t>Dois argumentos da empresa não procedem: a força vinculante da decisão criminal (art. 935 do Código Civil) e o depósito judicial da multa. Nenhum deles, porém, é necessário à conclusão. Antes da decisão, recomenda-se confirmar, junto à Petrobras, à AGU, ao MPF, ao TCU e à SFC/CGU, que não há decisão definitiva fixando dano pelos mesmos fatos.</w:t>
       </w:r>
     </w:p>
     <w:p>
@@ -665,7 +665,7 @@
           <w:b w:val="0"/>
           <w:i w:val="0"/>
         </w:rPr>
-        <w:t xml:space="preserve">O § 1º do art. 2º remetia a definição dos valores à Instrução Normativa CGU/AGU nº 2/2018. Essa IN foi revogada pelo art. 60 da Portaria Normativa Interministerial CGU/AGU nº 1/2025, antes do pedido. Desde então, a CGU adota o conceito de </w:t>
+        <w:t xml:space="preserve">O § 1º do art. 2º remetia a definição dos valores à Instrução Normativa CGU/AGU nº 2/2018. Essa IN foi revogada pelo art. 60 da Portaria Normativa Interministerial CGU/AGU nº 1/2025, antes do pedido. Na NT nº 676/2026, a SIPRI passou a adotar, por analogia, o conceito de </w:t>
       </w:r>
       <w:r>
         <w:rPr>
@@ -679,7 +679,7 @@
           <w:b w:val="0"/>
           <w:i w:val="0"/>
         </w:rPr>
-        <w:t>: o dano admitido pela pessoa jurídica ou o decorrente de decisão definitiva em processo administrativo ou judicial (art. 37, § 2º, do Decreto nº 11.129/2022; art. 33 da PNI nº 1/2025). A Nota Técnica nº 676/2026/SIPRI aplicou esse critério a outro caso de inidoneidade aplicada com base na Lei nº 8.666/1993:</w:t>
+        <w:t xml:space="preserve"> previsto para os acordos de leniência: o dano admitido pela pessoa jurídica ou o decorrente de decisão definitiva em processo administrativo ou judicial (art. 37, § 2º, do Decreto nº 11.129/2022; art. 33 da PNI nº 1/2025). Aquela Nota aplicou o critério a outro caso de inidoneidade aplicada com base na Lei nº 8.666/1993:</w:t>
       </w:r>
     </w:p>
     <w:p>
@@ -979,7 +979,7 @@
           <w:b w:val="0"/>
           <w:i w:val="0"/>
         </w:rPr>
-        <w:t>a) o atenuante do art. 18, II, do Decreto nº 8.420/2015 ("comprovação de ressarcimento [...] dos danos") passou de 0% para 1,5%, e a alíquota caiu de 7,5% para 6%;</w:t>
+        <w:t>a) o atenuante do art. 18, II, do Decreto nº 8.420/2015 passou de 0% para 1,5%, e a alíquota caiu de 7,5% para 6%;</w:t>
       </w:r>
     </w:p>
     <w:p>
@@ -1037,7 +1037,27 @@
           <w:b w:val="0"/>
           <w:i w:val="0"/>
         </w:rPr>
-        <w:t>Em síntese, ao decidir, a autoridade julgadora não manteve o apontamento de dano feito pela Comissão. Adotou fundamento expresso: o afastamento judicial da indenização e a inexistência de outros danos verificados. Isso se deu na dosimetria e não equivale a declaração formal de inexistência de dano (item 4.5.3). Basta, porém, para afastar a existência de prejuízo apontado e pendente. O Parecer da CONJUR ainda transcreve, no § 66, a frase da Comissão sobre o dano mínimo. A transcrição está no rol de fatores do art. 7º da Lei nº 12.846/2013 e é superada pelo cálculo efetivamente adotado nos §§ 72 e 73. Coerentemente, a Decisão nº 9 não quantifica dano nem condiciona a reabilitação a qualquer pagamento. Nisso difere da decisão examinada na NT nº 676/2026, que fixava expressamente tais condições.</w:t>
+        <w:t>A hipótese literal do art. 18, II, é a "comprovação de ressarcimento pela pessoa jurídica dos danos a que tenha dado causa". A COREP não afirmou que houve ressarcimento: aplicou o atenuante porque não havia dano a considerar. É uso atípico do dispositivo, e a correção técnica da dosimetria não cabe ser revista neste procedimento. O que importa aqui não é o atenuante em si, mas o juízo expresso da Administração sobre o dano: afastou o único valor apontado, à vista da decisão judicial, e registrou não haver outros danos verificados (§§ 60 a 62).</w:t>
+      </w:r>
+    </w:p>
+    <w:p>
+      <w:pPr>
+        <w:tabs>
+          <w:tab w:pos="709" w:val="left"/>
+        </w:tabs>
+        <w:ind w:firstLine="0"/>
+        <w:jc w:val="both"/>
+      </w:pPr>
+      <w:r>
+        <w:t>4.2.6.</w:t>
+        <w:tab/>
+      </w:r>
+      <w:r>
+        <w:rPr>
+          <w:b w:val="0"/>
+          <w:i w:val="0"/>
+        </w:rPr>
+        <w:t>Em síntese, a autoridade julgadora não manteve o apontamento de dano feito pela Comissão. Isso não equivale a declaração formal de inexistência de dano (item 4.5.3), mas afasta a existência de prejuízo apontado e pendente. O Parecer da CONJUR ainda transcreve, no § 66, a frase da Comissão sobre o dano mínimo. A transcrição está no rol de fatores do art. 7º da Lei nº 12.846/2013 e é superada pelo cálculo efetivamente adotado nos §§ 72 e 73. Coerentemente, a Decisão nº 9 não quantifica dano nem condiciona a reabilitação a qualquer pagamento. Nisso difere da decisão examinada na NT nº 676/2026, que fixava expressamente tais condições.</w:t>
       </w:r>
     </w:p>
     <w:p>
@@ -1158,7 +1178,7 @@
           <w:b w:val="0"/>
           <w:i w:val="0"/>
         </w:rPr>
-        <w:t>Outros elementos convergem: Paulo Roberto Costa declarou que o preço foi fixado pela área técnica, sem sua interferência, e o representante da Petrobras na contratação negou ingerência indevida (Parecer, §§ 46 e 47; sentença, §§ 184 a 186). A Petrobras informou que, nesse tipo de contratação, os preços são fixados por comparação com o mercado, sem planilha de formação de custos (Relatório Final, § 97). Não há, nos documentos examinados, indício de sobrepreço que permita supor que a propina foi repassada à estatal.</w:t>
+        <w:t>Outros elementos convergem. Paulo Roberto Costa afirmou recordar que o preço foi estabelecido pela área técnica e não se lembrar de ter opinado sobre ele. O representante da Petrobras na contratação relatou não ter percebido ingerência indevida do ex-Diretor (Parecer, §§ 46 e 47; sentença, §§ 183 e 184). A Petrobras informou que, nesse tipo de contratação, os preços são fixados por comparação com o mercado, sem planilha de formação de custos (Relatório Final, § 97). Não há, nos documentos examinados, indício de sobrepreço que permita supor que a propina foi repassada à estatal.</w:t>
       </w:r>
     </w:p>
     <w:p>
@@ -1178,7 +1198,7 @@
           <w:b w:val="0"/>
           <w:i w:val="0"/>
         </w:rPr>
-        <w:t>Por fim, o acórdão do TRF da 5ª Região que negou a suspensão das sanções (AI nº 0809667-58.2024.4.05.0000, 05/02/2025) registrou, de passagem, que a alegada ausência de dano não afasta a responsabilização, "mas tão somente [serve] para impedir a condenação pelo dano". A decisão é provisória e não examinou a reabilitação, mas o registro é coerente com a distinção feita nesta Nota entre sanção e ressarcimento.</w:t>
+        <w:t>Por fim, o acórdão do TRF da 5ª Região que deu parcial provimento ao agravo apenas para autorizar o depósito da multa, negando a suspensão das demais sanções (AI nº 0809667-58.2024.4.05.0000, 05/02/2025), registrou, de passagem, que a alegada ausência de dano não afasta a responsabilização, "mas tão somente [serve] para impedir a condenação pelo dano". A decisão é provisória e não examinou a reabilitação, mas o registro é coerente com a distinção feita nesta Nota entre sanção e ressarcimento.</w:t>
       </w:r>
     </w:p>
     <w:p>
@@ -1219,7 +1239,7 @@
           <w:b w:val="0"/>
           <w:i w:val="0"/>
         </w:rPr>
-        <w:t xml:space="preserve"> Procede, com fundamento mais amplo que o apresentado. Além da reforma da sentença, pesa o fato de que a própria decisão sancionadora, ao adotar a ressalva da COREP, não manteve dano pendente contra a empresa (itens 4.2.3 a 4.2.5). A empresa não alegou esse ponto.</w:t>
+        <w:t xml:space="preserve"> Procede, com fundamento mais amplo que o apresentado. Além da reforma da sentença, pesa o fato de que a própria decisão sancionadora, ao adotar a ressalva da COREP, não manteve dano pendente contra a empresa (itens 4.2.3 a 4.2.6). A empresa não alegou esse ponto.</w:t>
       </w:r>
     </w:p>
     <w:p>
@@ -1368,7 +1388,7 @@
           <w:b w:val="0"/>
           <w:i w:val="0"/>
         </w:rPr>
-        <w:t xml:space="preserve"> A presunção de que a propina foi embutida no preço cede diante de prova específica em contrário: a conclusão do TRF4, os depoimentos sobre a formação do preço e a informação da Petrobras (item 4.3.3). A COREP registrou expressamente que, apesar do entendimento geral da CGU, a decisão judicial devia prevalecer no caso concreto (item 4.2.3).</w:t>
+        <w:t xml:space="preserve"> A presunção de que a propina foi embutida no preço cede diante de prova específica em contrário: a conclusão do TRF4, os depoimentos sobre a formação do preço e a informação da Petrobras (item 4.3.3). A COREP registrou expressamente que, apesar do entendimento geral da CGU, a decisão judicial devia prevalecer no caso concreto (item 4.2.3). Há um elemento em sentido contrário: Paulo Roberto Costa declarou que, à época, a Petrobras "não tinha opção de tancagem" em Suape (Parecer, § 46). A falta de alternativa poderia, em tese, favorecer preço acima do mercado. Nenhuma das instâncias que examinaram o caso, porém, identificou ou quantificou sobrepreço: nem o juízo criminal, nem o TRF4, nem a Comissão, nem a COREP. A hipótese permanece, portanto, sem lastro documental.</w:t>
       </w:r>
     </w:p>
     <w:p>
@@ -1395,7 +1415,7 @@
           <w:b w:val="0"/>
           <w:i w:val="0"/>
         </w:rPr>
-        <w:t xml:space="preserve"> O apontamento da Comissão não subsistiu no julgamento (itens 4.2.3 a 4.2.5). Restam duas hipóteses: a comunicação ao Ministério Público e à AGU, ou iniciativa da Petrobras, pode ter resultado, depois de 2021, em decisão definitiva fixando dano. Se isso ocorreu, o quadro muda. Nada nos documentos examinados o indica, e a CGU não pode atestar a inexistência de crédito de terceiro sem consultá-lo. Daí a diligência do item 5.2, prevista no art. 4º, § 2º, da Portaria nº 1.214/2020 e adotada na NT nº 676/2026.</w:t>
+        <w:t xml:space="preserve"> O apontamento da Comissão não subsistiu no julgamento (itens 4.2.3 a 4.2.6). Resta uma hipótese: a comunicação ao Ministério Público e à AGU, ou iniciativa da Petrobras ou do TCU, pode ter resultado em decisão definitiva fixando dano, inclusive em data não alcançada pelo PAR. Se isso ocorreu, o quadro muda. Nada nos documentos examinados o indica, e a CGU não pode atestar a inexistência de crédito de terceiro sem consultá-lo. Daí a diligência do item 5.2, prevista no art. 4º, § 2º, da Portaria nº 1.214/2020 e adotada na NT nº 676/2026.</w:t>
       </w:r>
     </w:p>
     <w:p>
@@ -1422,7 +1442,7 @@
           <w:b w:val="0"/>
           <w:i w:val="0"/>
         </w:rPr>
-        <w:t xml:space="preserve"> Considerar o requisito atendido não equivale a declarar que não houve prejuízo, nem impede apurações futuras, nos mesmos termos da ressalva feita na NT nº 676/2026 (itens 4.47 e 4.48).</w:t>
+        <w:t xml:space="preserve"> Considerar o requisito superado não equivale a reconhecer ressarcimento nem a declarar que não houve prejuízo, e não impede apurações e cobranças futuras, nos mesmos termos da ressalva feita na NT nº 676/2026 (itens 4.47 e 4.48).</w:t>
       </w:r>
     </w:p>
     <w:p>
@@ -1463,14 +1483,14 @@
           <w:b/>
           <w:i w:val="0"/>
         </w:rPr>
-        <w:t>atendido o requisito do art. 2º, inciso II, da Portaria CGU nº 1.214/2020</w:t>
+        <w:t>superado o requisito do art. 2º, inciso II, da Portaria CGU nº 1.214/2020</w:t>
       </w:r>
       <w:r>
         <w:rPr>
           <w:b w:val="0"/>
           <w:i w:val="0"/>
         </w:rPr>
-        <w:t>. O único prejuízo apontado no PAR não foi mantido pela decisão sancionadora. Nos documentos examinados, não há prejuízo identificado e quantificado por decisão definitiva e pendente de ressarcimento em decorrência dos atos que justificaram a declaração de inidoneidade.</w:t>
+        <w:t>, por inexistência de prejuízo apontado pendente de ressarcimento. O único prejuízo apontado no PAR não foi mantido pela decisão sancionadora. Nos documentos examinados, não há prejuízo identificado e quantificado por decisão definitiva e pendente de ressarcimento em decorrência dos atos que justificaram a declaração de inidoneidade.</w:t>
       </w:r>
     </w:p>
     <w:p>
@@ -1490,7 +1510,7 @@
           <w:b w:val="0"/>
           <w:i w:val="0"/>
         </w:rPr>
-        <w:t>A conclusão do item 5.1 está documentada até o julgamento do PAR. Para torná-la definitiva, recomenda-se, antes da decisão final e com fundamento no art. 4º, § 2º, da Portaria nº 1.214/2020, oficiar à Petrobras, à Advocacia-Geral da União e ao Ministério Público Federal. Os dois últimos são os órgãos a quem o Relatório Final propôs comunicar os fatos. O objetivo é confirmar a inexistência de decisão administrativa ou judicial definitiva, posterior a 24/02/2021, que tenha fixado dano à Petrobras pelos mesmos fatos. Respostas negativas confirmam a conclusão. Resposta em sentido contrário imporá o reexame deste requisito, com ciência prévia à interessada.</w:t>
+        <w:t>A conclusão do item 5.1 está documentada até o julgamento do PAR. Para torná-la definitiva, recomenda-se, antes da decisão final e com fundamento no art. 4º, § 2º, da Portaria nº 1.214/2020, oficiar a cinco destinatários: à Petrobras, ente lesado; à Advocacia-Geral da União e ao Ministério Público Federal, a quem o Relatório Final propôs comunicar os fatos; e, a exemplo da NT nº 676/2026, ao Tribunal de Contas da União e à unidade da Secretaria Federal de Controle Interno responsável pela auditoria da Petrobras. O objetivo é confirmar a inexistência de decisão administrativa ou judicial definitiva que tenha identificado e quantificado dano à Petrobras pelos mesmos fatos, em qualquer data, inclusive após 24/02/2021. Respostas negativas confirmam a conclusão. Resposta em sentido contrário imporá o reexame deste requisito, com ciência prévia à interessada.</w:t>
       </w:r>
     </w:p>
     <w:p>

</xml_diff>

<commit_message>
NT DECAL: explicita o § 1º do art. 2º da Portaria 1.214 no item 4.1.4
Transcreve o dispositivo e explica, em linguagem direta, a revogação da
IN CGU/AGU 2/2018 e o critério do dano incontroverso; itens renumerados.

Co-Authored-By: Claude Opus 5.5 <noreply@anthropic.com>
Claude-Session: https://claude.ai/code/session_01FeoqTFRB1bKJcz5LGDxsk2
</commit_message>
<xml_diff>
--- a/DECAL/Nota_tecnica/NT_DECAL_art2_II_ressarcimento.docx
+++ b/DECAL/Nota_tecnica/NT_DECAL_art2_II_ressarcimento.docx
@@ -665,7 +665,42 @@
           <w:b w:val="0"/>
           <w:i w:val="0"/>
         </w:rPr>
-        <w:t xml:space="preserve">O § 1º do art. 2º remetia a definição dos valores à Instrução Normativa CGU/AGU nº 2/2018. Essa IN foi revogada pelo art. 60 da Portaria Normativa Interministerial CGU/AGU nº 1/2025, antes do pedido. Na NT nº 676/2026, a SIPRI passou a adotar, por analogia, o conceito de </w:t>
+        <w:t>O § 1º do mesmo art. 2º da Portaria CGU nº 1.214/2020 indica como se mede o prejuízo a ser ressarcido:</w:t>
+      </w:r>
+    </w:p>
+    <w:p>
+      <w:pPr>
+        <w:spacing w:after="160" w:line="240" w:lineRule="auto"/>
+        <w:ind w:left="2268"/>
+        <w:jc w:val="both"/>
+      </w:pPr>
+      <w:r>
+        <w:rPr>
+          <w:b w:val="0"/>
+          <w:i w:val="0"/>
+          <w:sz w:val="20"/>
+        </w:rPr>
+        <w:t>§ 1º Para fins de comprovação do disposto no inciso II, serão adotadas as definições e a metodologia constantes da Instrução Normativa CGU/AGU nº 2, de 16 de maio de 2018.</w:t>
+      </w:r>
+    </w:p>
+    <w:p>
+      <w:pPr>
+        <w:tabs>
+          <w:tab w:pos="709" w:val="left"/>
+        </w:tabs>
+        <w:ind w:firstLine="0"/>
+        <w:jc w:val="both"/>
+      </w:pPr>
+      <w:r>
+        <w:t>4.1.5.</w:t>
+        <w:tab/>
+      </w:r>
+      <w:r>
+        <w:rPr>
+          <w:b w:val="0"/>
+          <w:i w:val="0"/>
+        </w:rPr>
+        <w:t xml:space="preserve">Essa Instrução Normativa, que disciplinava os cálculos dos acordos de leniência, foi revogada pelo art. 60 da Portaria Normativa Interministerial CGU/AGU nº 1/2025, publicada em 23/12/2025, antes do pedido de reabilitação. Diante disso, a SIPRI, na NT nº 676/2026, passou a adotar, por analogia, o conceito de </w:t>
       </w:r>
       <w:r>
         <w:rPr>
@@ -679,7 +714,7 @@
           <w:b w:val="0"/>
           <w:i w:val="0"/>
         </w:rPr>
-        <w:t xml:space="preserve"> previsto para os acordos de leniência: o dano admitido pela pessoa jurídica ou o decorrente de decisão definitiva em processo administrativo ou judicial (art. 37, § 2º, do Decreto nº 11.129/2022; art. 33 da PNI nº 1/2025). Aquela Nota aplicou o critério a outro caso de inidoneidade aplicada com base na Lei nº 8.666/1993:</w:t>
+        <w:t xml:space="preserve"> das normas que a substituíram: o dano admitido pela própria pessoa jurídica ou o fixado em decisão definitiva, administrativa ou judicial (art. 37, § 2º, do Decreto nº 11.129/2022; art. 33 da PNI nº 1/2025). Em termos práticos, só se exige ressarcir o dano que a empresa reconheceu ou que uma decisão definitiva fixou. Aquela Nota aplicou o critério a outro caso de inidoneidade aplicada com base na Lei nº 8.666/1993:</w:t>
       </w:r>
     </w:p>
     <w:p>
@@ -722,7 +757,7 @@
         <w:jc w:val="both"/>
       </w:pPr>
       <w:r>
-        <w:t>4.1.5.</w:t>
+        <w:t>4.1.6.</w:t>
         <w:tab/>
       </w:r>
       <w:r>
@@ -780,7 +815,7 @@
         <w:jc w:val="both"/>
       </w:pPr>
       <w:r>
-        <w:t>4.1.6.</w:t>
+        <w:t>4.1.7.</w:t>
         <w:tab/>
       </w:r>
       <w:r>
@@ -1057,7 +1092,7 @@
           <w:b w:val="0"/>
           <w:i w:val="0"/>
         </w:rPr>
-        <w:t>Em síntese, a autoridade julgadora não manteve o apontamento de dano feito pela Comissão. Isso não equivale a declaração formal de inexistência de dano (item 4.5.3), mas afasta a existência de prejuízo apontado e pendente. O Parecer da CONJUR ainda transcreve, no § 66, a frase da Comissão sobre o dano mínimo. A transcrição está no rol de fatores do art. 7º da Lei nº 12.846/2013 e é superada pelo cálculo efetivamente adotado nos §§ 72 e 73. Coerentemente, a Decisão nº 9 não quantifica dano nem condiciona a reabilitação a qualquer pagamento. Nisso difere da decisão examinada na NT nº 676/2026, que fixava expressamente tais condições.</w:t>
+        <w:t>Em síntese, a autoridade julgadora não manteve o apontamento de dano feito pela Comissão. Isso não equivale a declaração formal de inexistência de dano (item 4.5.3), mas afasta a existência de prejuízo apontado e pendente. O Parecer da CONJUR ainda transcreve, no § 66, a frase da Comissão sobre o dano mínimo. A transcrição está no rol de fatores do art. 7º da Lei nº 12.846/2013 e é superada pelo cálculo efetivamente adotado nos §§ 72 e 73. Coerentemente, a Decisão nº 9 não quantifica dano nem condiciona a reabilitação a qualquer pagamento.</w:t>
       </w:r>
     </w:p>
     <w:p>
@@ -1347,7 +1382,7 @@
           <w:b w:val="0"/>
           <w:i w:val="0"/>
         </w:rPr>
-        <w:t xml:space="preserve"> Não decidem o requisito, que é legal e objetivo, e não precisam ser ponderados aqui, dado o resultado alcançado.</w:t>
+        <w:t xml:space="preserve"> Não decidem o requisito, que é legal e objetivo.</w:t>
       </w:r>
     </w:p>
     <w:p>
@@ -1569,7 +1604,7 @@
     </w:p>
     <w:sectPr>
       <w:pgSz w:w="11906" w:h="16838"/>
-      <w:pgMar w:top="1417" w:right="1134" w:bottom="1134" w:left="1701" w:header="720" w:footer="720" w:gutter="0"/>
+      <w:pgMar w:top="1134" w:right="1134" w:bottom="1134" w:left="1701" w:header="720" w:footer="720" w:gutter="0"/>
       <w:cols w:space="720"/>
       <w:docGrid w:linePitch="360"/>
     </w:sectPr>
@@ -1941,7 +1976,7 @@
     <w:qFormat/>
     <w:rsid w:val="00FC693F"/>
     <w:pPr>
-      <w:spacing w:after="120" w:line="276" w:lineRule="auto"/>
+      <w:spacing w:after="80" w:line="276" w:lineRule="auto"/>
     </w:pPr>
     <w:rPr>
       <w:rFonts w:ascii="Calibri" w:hAnsi="Calibri" w:eastAsia="Calibri"/>

</xml_diff>